<commit_message>
Simulador com golpes reais, comando de batalha e resultados atualizados
- Simulador passa a usar os golpes que cada Pokémon aprende (PokéAPI): poder, precisão,
  prioridade, acertos múltiplos, recuo, dreno e mudanças de atributo
- Versão com golpes genéricos mantida para comparação (batalhas_golpes_simples.csv)
- Pares de confrontos sorteados com gerador próprio (mesmos confrontos nas duas versões)
- Novo src/batalhar.py: escolha de geração, sorteio e batalha narrada
- Notebook, README, guia, resumo e diário de IA atualizados (SVM 86,6% no teste)

Co-Authored-By: Claude Opus 5.5 <noreply@anthropic.com>
</commit_message>
<xml_diff>
--- a/docs/Resumo_Expandido_Rascunho.docx
+++ b/docs/Resumo_Expandido_Rascunho.docx
@@ -188,7 +188,7 @@
         <w:t xml:space="preserve">Dados. </w:t>
       </w:r>
       <w:r>
-        <w:t xml:space="preserve">Os atributos, tipos e gerações de 1.242 Pokémon jogáveis (gerações 1 a 9, incluindo formas alternativas como Mega e regionais) foram obtidos dos dados abertos do PokéAPI (licença BSD-3), após a remoção de 66 formas cosméticas e 43 formas repetidas. Como o principal conjunto público de batalhas cobre apenas seis gerações e foi gerado por um algoritmo não documentado, o grupo desenvolveu um simulador baseado na fórmula de dano dos jogos principais (nível 50, golpes de 80 de poder com bônus de mesmo tipo, golpe de cobertura, fator aleatório entre 0,85 e 1,00 e golpe crítico com chance de 1/24). Foram sorteados 40.000 confrontos, cada um simulado 21 vezes. A variável-alvo indica se o Pokémon A venceu a maioria das simulações, e as classes ficaram equilibradas (cerca de 50%).</w:t>
+        <w:t xml:space="preserve">Os atributos, tipos e gerações de 1.242 Pokémon jogáveis (gerações 1 a 9, incluindo formas alternativas como Mega e regionais) foram obtidos dos dados abertos do PokéAPI (licença BSD-3), após a remoção de 66 formas cosméticas e 43 formas repetidas. Como o principal conjunto público de batalhas cobre apenas seis gerações e foi gerado por um algoritmo não documentado, o grupo desenvolveu um simulador baseado na fórmula de dano dos jogos principais (nível 50, fator aleatório entre 0,85 e 1,00 e golpes críticos). Cada Pokémon luta com os golpes de dano que realmente aprende nos jogos, segundo o PokéAPI, considerando poder, tipo, precisão, prioridade, acertos múltiplos, dano de retorno, roubo de vida e queda de atributos, e escolhe a cada turno o golpe de maior dano esperado. Habilidades, itens, golpes de status e trocas não são simulados. Foram sorteados 40.000 confrontos, cada um simulado 21 vezes. A variável-alvo indica se o Pokémon A venceu a maioria das simulações, e as classes ficaram equilibradas (cerca de 50%).</w:t>
       </w:r>
     </w:p>
     <w:p>
@@ -245,7 +245,7 @@
         <w:jc w:val="both"/>
       </w:pPr>
       <w:r>
-        <w:t xml:space="preserve">A análise exploratória mostrou que a velocidade, isoladamente, decide apenas 67,4% dos confrontos, enquanto a vantagem de tipo tem efeito forte: com a maior vantagem, o Pokémon A vence 97,9% das vezes e, com a maior desvantagem, apenas 3,3%. A aleatoriedade tem peso limitado: 83,5% dos confrontos tiveram o mesmo vencedor nas 21 simulações e 2,9% foram equilibrados, o que impõe um teto ao acerto possível. A Tabela 1 apresenta os resultados no conjunto de teste.</w:t>
+        <w:t xml:space="preserve">A análise exploratória mostrou que a velocidade, isoladamente, decide apenas 70,2% dos confrontos, e a maior soma de atributos, 82,2%. A vantagem de tipo tem efeito forte: com a maior vantagem, o Pokémon A vence 82,5% das vezes e, com a maior desvantagem, 17,8%. O efeito não é absoluto porque o Pokémon em desvantagem frequentemente possui golpes de cobertura de outros tipos. A aleatoriedade tem peso limitado: 71,1% dos confrontos tiveram o mesmo vencedor nas 21 simulações e 5,7% foram equilibrados, o que impõe um teto ao acerto possível. A Tabela 1 apresenta os resultados no conjunto de teste.</w:t>
       </w:r>
     </w:p>
     <w:p>
@@ -469,7 +469,7 @@
                 <w:sz w:val="20"/>
                 <w:szCs w:val="20"/>
               </w:rPr>
-              <w:t xml:space="preserve">0,496</w:t>
+              <w:t xml:space="preserve">0,510</w:t>
             </w:r>
           </w:p>
         </w:tc>
@@ -595,7 +595,7 @@
                 <w:sz w:val="20"/>
                 <w:szCs w:val="20"/>
               </w:rPr>
-              <w:t xml:space="preserve">0,674</w:t>
+              <w:t xml:space="preserve">0,678</w:t>
             </w:r>
           </w:p>
         </w:tc>
@@ -626,7 +626,7 @@
                 <w:sz w:val="20"/>
                 <w:szCs w:val="20"/>
               </w:rPr>
-              <w:t xml:space="preserve">0,678</w:t>
+              <w:t xml:space="preserve">0,675</w:t>
             </w:r>
           </w:p>
         </w:tc>
@@ -657,7 +657,7 @@
                 <w:sz w:val="20"/>
                 <w:szCs w:val="20"/>
               </w:rPr>
-              <w:t xml:space="preserve">0,701</w:t>
+              <w:t xml:space="preserve">0,713</w:t>
             </w:r>
           </w:p>
         </w:tc>
@@ -721,7 +721,7 @@
                 <w:sz w:val="20"/>
                 <w:szCs w:val="20"/>
               </w:rPr>
-              <w:t xml:space="preserve">0,795</w:t>
+              <w:t xml:space="preserve">0,806</w:t>
             </w:r>
           </w:p>
         </w:tc>
@@ -752,7 +752,7 @@
                 <w:sz w:val="20"/>
                 <w:szCs w:val="20"/>
               </w:rPr>
-              <w:t xml:space="preserve">0,797</w:t>
+              <w:t xml:space="preserve">0,802</w:t>
             </w:r>
           </w:p>
         </w:tc>
@@ -783,7 +783,7 @@
                 <w:sz w:val="20"/>
                 <w:szCs w:val="20"/>
               </w:rPr>
-              <w:t xml:space="preserve">0,885</w:t>
+              <w:t xml:space="preserve">0,898</w:t>
             </w:r>
           </w:p>
         </w:tc>
@@ -847,7 +847,7 @@
                 <w:sz w:val="20"/>
                 <w:szCs w:val="20"/>
               </w:rPr>
-              <w:t xml:space="preserve">0,910</w:t>
+              <w:t xml:space="preserve">0,856</w:t>
             </w:r>
           </w:p>
         </w:tc>
@@ -878,7 +878,7 @@
                 <w:sz w:val="20"/>
                 <w:szCs w:val="20"/>
               </w:rPr>
-              <w:t xml:space="preserve">0,911</w:t>
+              <w:t xml:space="preserve">0,853</w:t>
             </w:r>
           </w:p>
         </w:tc>
@@ -909,7 +909,7 @@
                 <w:sz w:val="20"/>
                 <w:szCs w:val="20"/>
               </w:rPr>
-              <w:t xml:space="preserve">0,975</w:t>
+              <w:t xml:space="preserve">0,936</w:t>
             </w:r>
           </w:p>
         </w:tc>
@@ -973,7 +973,7 @@
                 <w:sz w:val="20"/>
                 <w:szCs w:val="20"/>
               </w:rPr>
-              <w:t xml:space="preserve">0,922</w:t>
+              <w:t xml:space="preserve">0,866</w:t>
             </w:r>
           </w:p>
         </w:tc>
@@ -1004,7 +1004,7 @@
                 <w:sz w:val="20"/>
                 <w:szCs w:val="20"/>
               </w:rPr>
-              <w:t xml:space="preserve">0,922</w:t>
+              <w:t xml:space="preserve">0,863</w:t>
             </w:r>
           </w:p>
         </w:tc>
@@ -1035,7 +1035,7 @@
                 <w:sz w:val="20"/>
                 <w:szCs w:val="20"/>
               </w:rPr>
-              <w:t xml:space="preserve">0,981</w:t>
+              <w:t xml:space="preserve">0,935</w:t>
             </w:r>
           </w:p>
         </w:tc>
@@ -1060,7 +1060,7 @@
         <w:jc w:val="both"/>
       </w:pPr>
       <w:r>
-        <w:t xml:space="preserve">O SVM obteve o melhor desempenho (92,2% de acurácia), superando com folga as regras simples, mas com vantagem pequena sobre a Regressão Logística (91,0%). Erros remanescentes concentram-se em confrontos equilibrados e em situações de “limiar de nocaute”, como Pikachu contra Gyarados, em que a vantagem de tipo é grande, mas insuficiente para vencer sem golpe crítico. Como próximos passos, serão comparados kernels, avaliada a contribuição das features de tipo, ajustados os hiperparâmetros C e gamma com validação cruzada agrupada por personagem e medido o efeito de uma divisão com vazamento.</w:t>
+        <w:t xml:space="preserve">O SVM obteve a maior acurácia (86,6%), superando com folga as regras simples, mas com vantagem pequena sobre a Regressão Logística (85,6%). Em uma versão anterior do simulador, com golpes genéricos de mesmo poder, o mesmo modelo atingia 92,1%: o realismo dos golpes tornou a previsão mais difícil, pois o modelo conhece apenas atributos e tipos, e não os golpes de cada personagem. Um exemplo é o confronto Pikachu contra Gyarados, previsto a favor do Gyarados, mas vencido pelo Pikachu com o golpe Volt Tackle. Como próximos passos, serão incluídas features derivadas dos golpes, comparados kernels, ajustados os hiperparâmetros C e gamma com validação cruzada agrupada por personagem e medido o efeito de uma divisão com vazamento.</w:t>
       </w:r>
     </w:p>
     <w:p>

</xml_diff>

<commit_message>
Adiciona DOIs e links às referências do resumo expandido
Co-Authored-By: Claude Opus 5.5 <noreply@anthropic.com>
</commit_message>
<xml_diff>
--- a/docs/Resumo_Expandido_Rascunho.docx
+++ b/docs/Resumo_Expandido_Rascunho.docx
@@ -1102,7 +1102,7 @@
         <w:t xml:space="preserve">Proceedings</w:t>
       </w:r>
       <w:r>
-        <w:t xml:space="preserve"> [...]. New York: ACM, 1992. p. 144–152.</w:t>
+        <w:t xml:space="preserve"> [...]. New York: ACM, 1992. p. 144–152. DOI: 10.1145/130385.130401.</w:t>
       </w:r>
     </w:p>
     <w:p>
@@ -1121,7 +1121,7 @@
         <w:t xml:space="preserve">Machine Learning</w:t>
       </w:r>
       <w:r>
-        <w:t xml:space="preserve">, v. 20, n. 3, p. 273–297, 1995.</w:t>
+        <w:t xml:space="preserve">, v. 20, n. 3, p. 273–297, 1995. DOI: 10.1007/BF00994018.</w:t>
       </w:r>
     </w:p>
     <w:p>
@@ -1140,7 +1140,7 @@
         <w:t xml:space="preserve">A practical guide to support vector classification</w:t>
       </w:r>
       <w:r>
-        <w:t xml:space="preserve">. Taipei: National Taiwan University, 2003. Relatório técnico.</w:t>
+        <w:t xml:space="preserve">. Taipei: National Taiwan University, 2003. Relatório técnico. Disponível em: https://www.csie.ntu.edu.tw/~cjlin/papers/guide/guide.pdf.</w:t>
       </w:r>
     </w:p>
     <w:p>
@@ -1159,7 +1159,7 @@
         <w:t xml:space="preserve">ACM Transactions on Knowledge Discovery from Data</w:t>
       </w:r>
       <w:r>
-        <w:t xml:space="preserve">, v. 6, n. 4, p. 15:1–15:21, 2012.</w:t>
+        <w:t xml:space="preserve">, v. 6, n. 4, p. 15:1–15:21, 2012. DOI: 10.1145/2382577.2382579.</w:t>
       </w:r>
     </w:p>
     <w:p>
@@ -1188,7 +1188,7 @@
         <w:t xml:space="preserve">Journal of Machine Learning Research</w:t>
       </w:r>
       <w:r>
-        <w:t xml:space="preserve">, v. 12, p. 2825–2830, 2011.</w:t>
+        <w:t xml:space="preserve">, v. 12, n. 85, p. 2825–2830, 2011. Disponível em: https://jmlr.org/papers/v12/pedregosa11a.html.</w:t>
       </w:r>
     </w:p>
     <w:p>
@@ -1226,7 +1226,7 @@
         <w:t xml:space="preserve">Artificial intelligence and games</w:t>
       </w:r>
       <w:r>
-        <w:t xml:space="preserve">. Cham: Springer, 2018.</w:t>
+        <w:t xml:space="preserve">. Cham: Springer, 2018. ISBN 978-3-319-63518-7.</w:t>
       </w:r>
     </w:p>
     <w:sectPr>

</xml_diff>

<commit_message>
Adiciona nomes completos dos integrantes no README e no resumo
Co-Authored-By: Claude Opus 5.5 <noreply@anthropic.com>
</commit_message>
<xml_diff>
--- a/docs/Resumo_Expandido_Rascunho.docx
+++ b/docs/Resumo_Expandido_Rascunho.docx
@@ -37,10 +37,7 @@
         <w:jc w:val="center"/>
       </w:pPr>
       <w:r>
-        <w:rPr>
-          <w:highlight w:val="yellow"/>
-        </w:rPr>
-        <w:t xml:space="preserve">Alceu [sobrenome]; Anthony [sobrenome]; Gustavo [sobrenome]; Luan [sobrenome]; Lucas [sobrenome]</w:t>
+        <w:t xml:space="preserve">Alceu Ferreira dos Santos Neto; Anthony Gabriel Schirato Lourenço; Gustavo de Carvalho Vieira; Luan Carlos de Souza Ferreira; Lucas Miguel Moreno Rios</w:t>
       </w:r>
     </w:p>
     <w:p>

</xml_diff>

<commit_message>
Completa curso e professor no resumo e no README
Co-Authored-By: Claude Opus 5.5 <noreply@anthropic.com>
</commit_message>
<xml_diff>
--- a/docs/Resumo_Expandido_Rascunho.docx
+++ b/docs/Resumo_Expandido_Rascunho.docx
@@ -54,9 +54,9 @@
       </w:r>
       <w:r>
         <w:rPr>
-          <w:highlight w:val="yellow"/>
-        </w:rPr>
-        <w:t xml:space="preserve">[curso] · FIB · Orientador(a): [nome do professor]</w:t>
+          <w:sz w:val="20"/>
+        </w:rPr>
+        <w:t xml:space="preserve">Ciência da Computação · FIB · Orientador: Prof. Ronaldo Cesar Dametto</w:t>
       </w:r>
     </w:p>
     <w:p>

</xml_diff>